<commit_message>
Update workflow validation and release artifacts
</commit_message>
<xml_diff>
--- a/Template/Procurement/1.ขอจ้างต่อเนื่อง 630.docx
+++ b/Template/Procurement/1.ขอจ้างต่อเนื่อง 630.docx
@@ -5,7 +5,7 @@
     <w:p>
       <w:pPr>
         <w:rPr>
-          <w:rFonts w:ascii="TH SarabunIT๙" w:hAnsi="TH SarabunIT๙" w:cs="TH SarabunIT๙" w:hint="cs"/>
+          <w:rFonts w:ascii="TH SarabunIT๙" w:hAnsi="TH SarabunIT๙" w:cs="TH SarabunIT๙"/>
           <w:sz w:val="32"/>
           <w:szCs w:val="32"/>
           <w:cs/>
@@ -117,7 +117,7 @@
       <w:pPr>
         <w:ind w:left="1418" w:hanging="1418"/>
         <w:rPr>
-          <w:rFonts w:ascii="TH SarabunIT๙" w:hAnsi="TH SarabunIT๙" w:cs="TH SarabunIT๙" w:hint="cs"/>
+          <w:rFonts w:ascii="TH SarabunIT๙" w:hAnsi="TH SarabunIT๙" w:cs="TH SarabunIT๙"/>
           <w:sz w:val="32"/>
           <w:szCs w:val="32"/>
           <w:cs/>
@@ -172,7 +172,7 @@
     <w:p>
       <w:pPr>
         <w:rPr>
-          <w:rFonts w:ascii="TH SarabunIT๙" w:hAnsi="TH SarabunIT๙" w:cs="TH SarabunIT๙" w:hint="cs"/>
+          <w:rFonts w:ascii="TH SarabunIT๙" w:hAnsi="TH SarabunIT๙" w:cs="TH SarabunIT๙"/>
           <w:color w:val="FF0000"/>
           <w:sz w:val="32"/>
           <w:szCs w:val="32"/>
@@ -357,7 +357,7 @@
       <w:pPr>
         <w:spacing w:after="240"/>
         <w:rPr>
-          <w:rFonts w:ascii="TH SarabunIT๙" w:hAnsi="TH SarabunIT๙" w:cs="TH SarabunIT๙" w:hint="cs"/>
+          <w:rFonts w:ascii="TH SarabunIT๙" w:hAnsi="TH SarabunIT๙" w:cs="TH SarabunIT๙"/>
           <w:sz w:val="32"/>
           <w:szCs w:val="32"/>
           <w:cs/>
@@ -582,20 +582,20 @@
         <w:ind w:firstLine="1134"/>
         <w:jc w:val="thaiDistribute"/>
         <w:rPr>
+          <w:rFonts w:ascii="TH SarabunIT๙" w:hAnsi="TH SarabunIT๙" w:cs="TH SarabunIT๙"/>
+          <w:b/>
+          <w:bCs/>
+          <w:sz w:val="32"/>
+          <w:szCs w:val="32"/>
+        </w:rPr>
+      </w:pPr>
+      <w:r>
+        <w:rPr>
           <w:rFonts w:ascii="TH SarabunIT๙" w:hAnsi="TH SarabunIT๙" w:cs="TH SarabunIT๙" w:hint="cs"/>
           <w:b/>
           <w:bCs/>
           <w:sz w:val="32"/>
           <w:szCs w:val="32"/>
-        </w:rPr>
-      </w:pPr>
-      <w:r>
-        <w:rPr>
-          <w:rFonts w:ascii="TH SarabunIT๙" w:hAnsi="TH SarabunIT๙" w:cs="TH SarabunIT๙" w:hint="cs"/>
-          <w:b/>
-          <w:bCs/>
-          <w:sz w:val="32"/>
-          <w:szCs w:val="32"/>
           <w:cs/>
         </w:rPr>
         <w:t>ข้อเท็จจริง</w:t>
@@ -607,7 +607,7 @@
         <w:ind w:firstLine="1134"/>
         <w:jc w:val="thaiDistribute"/>
         <w:rPr>
-          <w:rFonts w:ascii="TH SarabunIT๙" w:hAnsi="TH SarabunIT๙" w:cs="TH SarabunIT๙" w:hint="cs"/>
+          <w:rFonts w:ascii="TH SarabunIT๙" w:hAnsi="TH SarabunIT๙" w:cs="TH SarabunIT๙"/>
           <w:sz w:val="32"/>
           <w:szCs w:val="32"/>
         </w:rPr>
@@ -637,7 +637,27 @@
           <w:szCs w:val="32"/>
           <w:cs/>
         </w:rPr>
-        <w:t>แนวทางการบริหารจัดการอัตราจ้างผู้ปฏิบัติงานให้ราชการที่สำนักงานคณะกรรมการการศึกษาขั้นพื้นฐานได้กำหนดไว้ จึงอาศัยหนังสือคณะกรรมการวินิจฉัยปัญหาการจัดซื้อจัดจ้างและการบริหารพัสดุภาครัฐ ด่วนที่สุด ที่ กค (กวจ) 0405.2/ว</w:t>
+        <w:t>แนวทางการบริหารจัดการอัตราจ้างผู้ปฏิบัติงานให้ราชการที่สำนักงานคณะกรรมการการศึกษาขั้นพื้นฐานได้กำหนดไว้ จึงอาศัยหนังสือคณะกรรมการวินิจฉัยปัญหาการจัดซื้อจัดจ้างและการบริหารพัสดุภาครัฐ ด่วนที่สุด ที่ กค (</w:t>
+      </w:r>
+      <w:proofErr w:type="spellStart"/>
+      <w:r>
+        <w:rPr>
+          <w:rFonts w:ascii="TH SarabunIT๙" w:eastAsia="Times New Roman" w:hAnsi="TH SarabunIT๙" w:cs="TH SarabunIT๙" w:hint="cs"/>
+          <w:sz w:val="32"/>
+          <w:szCs w:val="32"/>
+          <w:cs/>
+        </w:rPr>
+        <w:t>กวจ</w:t>
+      </w:r>
+      <w:proofErr w:type="spellEnd"/>
+      <w:r>
+        <w:rPr>
+          <w:rFonts w:ascii="TH SarabunIT๙" w:eastAsia="Times New Roman" w:hAnsi="TH SarabunIT๙" w:cs="TH SarabunIT๙" w:hint="cs"/>
+          <w:sz w:val="32"/>
+          <w:szCs w:val="32"/>
+          <w:cs/>
+        </w:rPr>
+        <w:t>) 0405.2/ว</w:t>
       </w:r>
       <w:r>
         <w:rPr>
@@ -757,12 +777,12 @@
     </w:p>
     <w:p>
       <w:pPr>
-        <w:pStyle w:val="af"/>
+        <w:pStyle w:val="af0"/>
         <w:spacing w:after="0" w:line="240" w:lineRule="auto"/>
         <w:ind w:left="0" w:firstLine="1077"/>
         <w:jc w:val="thaiDistribute"/>
         <w:rPr>
-          <w:rFonts w:ascii="TH SarabunIT๙" w:hAnsi="TH SarabunIT๙" w:cs="TH SarabunIT๙" w:hint="cs"/>
+          <w:rFonts w:ascii="TH SarabunIT๙" w:hAnsi="TH SarabunIT๙" w:cs="TH SarabunIT๙"/>
           <w:b/>
           <w:bCs/>
           <w:sz w:val="32"/>
@@ -1195,16 +1215,694 @@
         <w:ind w:left="1437"/>
         <w:jc w:val="thaiDistribute"/>
         <w:rPr>
-          <w:rFonts w:ascii="TH SarabunIT๙" w:eastAsia="Times New Roman" w:hAnsi="TH SarabunIT๙" w:cs="TH SarabunIT๙" w:hint="cs"/>
-          <w:sz w:val="32"/>
-          <w:szCs w:val="32"/>
-        </w:rPr>
-      </w:pPr>
+          <w:rFonts w:ascii="TH SarabunIT๙" w:eastAsia="Times New Roman" w:hAnsi="TH SarabunIT๙" w:cs="TH SarabunIT๙"/>
+          <w:sz w:val="32"/>
+          <w:szCs w:val="32"/>
+        </w:rPr>
+      </w:pPr>
+      <w:r>
+        <w:rPr>
+          <w:noProof/>
+        </w:rPr>
+        <mc:AlternateContent>
+          <mc:Choice Requires="wps">
+            <w:drawing>
+              <wp:anchor distT="45720" distB="45720" distL="114300" distR="114300" simplePos="0" relativeHeight="251659264" behindDoc="0" locked="0" layoutInCell="1" allowOverlap="1" wp14:anchorId="200C72C2" wp14:editId="66910107">
+                <wp:simplePos x="0" y="0"/>
+                <wp:positionH relativeFrom="column">
+                  <wp:posOffset>3291840</wp:posOffset>
+                </wp:positionH>
+                <wp:positionV relativeFrom="paragraph">
+                  <wp:posOffset>142875</wp:posOffset>
+                </wp:positionV>
+                <wp:extent cx="2637155" cy="2181225"/>
+                <wp:effectExtent l="0" t="0" r="10795" b="28575"/>
+                <wp:wrapSquare wrapText="bothSides"/>
+                <wp:docPr id="936539965" name="Text Box 2"/>
+                <wp:cNvGraphicFramePr>
+                  <a:graphicFrameLocks xmlns:a="http://schemas.openxmlformats.org/drawingml/2006/main"/>
+                </wp:cNvGraphicFramePr>
+                <a:graphic xmlns:a="http://schemas.openxmlformats.org/drawingml/2006/main">
+                  <a:graphicData uri="http://schemas.microsoft.com/office/word/2010/wordprocessingShape">
+                    <wps:wsp>
+                      <wps:cNvSpPr txBox="1">
+                        <a:spLocks noChangeArrowheads="1"/>
+                      </wps:cNvSpPr>
+                      <wps:spPr bwMode="auto">
+                        <a:xfrm>
+                          <a:off x="0" y="0"/>
+                          <a:ext cx="2637155" cy="2181225"/>
+                        </a:xfrm>
+                        <a:prstGeom prst="rect">
+                          <a:avLst/>
+                        </a:prstGeom>
+                        <a:solidFill>
+                          <a:srgbClr val="FFFFFF"/>
+                        </a:solidFill>
+                        <a:ln w="9525">
+                          <a:solidFill>
+                            <a:srgbClr val="000000"/>
+                          </a:solidFill>
+                          <a:miter lim="800000"/>
+                          <a:headEnd/>
+                          <a:tailEnd/>
+                        </a:ln>
+                      </wps:spPr>
+                      <wps:txbx>
+                        <w:txbxContent>
+                          <w:p>
+                            <w:pPr>
+                              <w:rPr>
+                                <w:rFonts w:ascii="TH SarabunIT๙" w:hAnsi="TH SarabunIT๙" w:cs="TH SarabunIT๙"/>
+                                <w:spacing w:val="-10"/>
+                                <w:sz w:val="32"/>
+                                <w:szCs w:val="32"/>
+                              </w:rPr>
+                            </w:pPr>
+                            <w:r>
+                              <w:rPr>
+                                <w:rFonts w:ascii="TH SarabunIT๙" w:hAnsi="TH SarabunIT๙" w:cs="TH SarabunIT๙"/>
+                                <w:spacing w:val="-10"/>
+                                <w:sz w:val="32"/>
+                                <w:szCs w:val="32"/>
+                                <w:cs/>
+                              </w:rPr>
+                              <w:t>(   ) ทราบ/เห็นชอบ</w:t>
+                            </w:r>
+                          </w:p>
+                          <w:p>
+                            <w:pPr>
+                              <w:rPr>
+                                <w:rFonts w:ascii="TH SarabunIT๙" w:hAnsi="TH SarabunIT๙" w:cs="TH SarabunIT๙"/>
+                                <w:spacing w:val="-10"/>
+                                <w:sz w:val="32"/>
+                                <w:szCs w:val="32"/>
+                              </w:rPr>
+                            </w:pPr>
+                            <w:r>
+                              <w:rPr>
+                                <w:rFonts w:ascii="TH SarabunIT๙" w:hAnsi="TH SarabunIT๙" w:cs="TH SarabunIT๙"/>
+                                <w:spacing w:val="-10"/>
+                                <w:sz w:val="32"/>
+                                <w:szCs w:val="32"/>
+                                <w:cs/>
+                              </w:rPr>
+                              <w:t>(   ) อนุมัติ</w:t>
+                            </w:r>
+                            <w:r>
+                              <w:rPr>
+                                <w:rFonts w:ascii="TH SarabunIT๙" w:hAnsi="TH SarabunIT๙" w:cs="TH SarabunIT๙" w:hint="cs"/>
+                                <w:spacing w:val="-10"/>
+                                <w:sz w:val="32"/>
+                                <w:szCs w:val="32"/>
+                                <w:cs/>
+                              </w:rPr>
+                              <w:t>ดำเนินการ</w:t>
+                            </w:r>
+                          </w:p>
+                          <w:p>
+                            <w:pPr>
+                              <w:rPr>
+                                <w:rFonts w:ascii="TH SarabunIT๙" w:hAnsi="TH SarabunIT๙" w:cs="TH SarabunIT๙"/>
+                                <w:spacing w:val="-10"/>
+                                <w:sz w:val="32"/>
+                                <w:szCs w:val="32"/>
+                              </w:rPr>
+                            </w:pPr>
+                            <w:r>
+                              <w:rPr>
+                                <w:rFonts w:ascii="TH SarabunIT๙" w:hAnsi="TH SarabunIT๙" w:cs="TH SarabunIT๙"/>
+                                <w:spacing w:val="-10"/>
+                                <w:sz w:val="32"/>
+                                <w:szCs w:val="32"/>
+                                <w:cs/>
+                              </w:rPr>
+                              <w:t>(   ) ....................................................................</w:t>
+                            </w:r>
+                          </w:p>
+                          <w:p>
+                            <w:pPr>
+                              <w:rPr>
+                                <w:rFonts w:ascii="TH SarabunIT๙" w:hAnsi="TH SarabunIT๙" w:cs="TH SarabunIT๙"/>
+                                <w:spacing w:val="-10"/>
+                              </w:rPr>
+                            </w:pPr>
+                          </w:p>
+                          <w:p>
+                            <w:pPr>
+                              <w:rPr>
+                                <w:rFonts w:ascii="TH SarabunIT๙" w:hAnsi="TH SarabunIT๙" w:cs="TH SarabunIT๙"/>
+                                <w:spacing w:val="-10"/>
+                              </w:rPr>
+                            </w:pPr>
+                          </w:p>
+                          <w:p>
+                            <w:pPr>
+                              <w:rPr>
+                                <w:rFonts w:ascii="TH SarabunIT๙" w:hAnsi="TH SarabunIT๙" w:cs="TH SarabunIT๙"/>
+                                <w:spacing w:val="-10"/>
+                              </w:rPr>
+                            </w:pPr>
+                          </w:p>
+                          <w:p>
+                            <w:pPr>
+                              <w:jc w:val="center"/>
+                              <w:rPr>
+                                <w:rFonts w:ascii="TH SarabunIT๙" w:hAnsi="TH SarabunIT๙" w:cs="TH SarabunIT๙"/>
+                                <w:spacing w:val="-10"/>
+                                <w:sz w:val="32"/>
+                                <w:szCs w:val="32"/>
+                              </w:rPr>
+                            </w:pPr>
+                            <w:r>
+                              <w:rPr>
+                                <w:rFonts w:ascii="TH SarabunIT๙" w:hAnsi="TH SarabunIT๙" w:cs="TH SarabunIT๙" w:hint="cs"/>
+                                <w:spacing w:val="-10"/>
+                                <w:sz w:val="32"/>
+                                <w:szCs w:val="32"/>
+                                <w:cs/>
+                              </w:rPr>
+                              <w:t>(</w:t>
+                            </w:r>
+                            <w:r>
+                              <w:rPr>
+                                <w:rFonts w:ascii="TH SarabunIT๙" w:hAnsi="TH SarabunIT๙" w:cs="TH SarabunIT๙"/>
+                                <w:spacing w:val="-10"/>
+                                <w:sz w:val="32"/>
+                                <w:szCs w:val="32"/>
+                              </w:rPr>
+                              <w:t>{</w:t>
+                            </w:r>
+                            <w:r>
+                              <w:rPr>
+                                <w:rFonts w:ascii="TH SarabunIT๙" w:hAnsi="TH SarabunIT๙" w:cs="TH SarabunIT๙" w:hint="cs"/>
+                                <w:spacing w:val="-10"/>
+                                <w:sz w:val="32"/>
+                                <w:szCs w:val="32"/>
+                                <w:cs/>
+                              </w:rPr>
+                              <w:t>คำนำหน้า</w:t>
+                            </w:r>
+                            <w:proofErr w:type="spellStart"/>
+                            <w:r>
+                              <w:rPr>
+                                <w:rFonts w:ascii="TH SarabunIT๙" w:hAnsi="TH SarabunIT๙" w:cs="TH SarabunIT๙" w:hint="cs"/>
+                                <w:spacing w:val="-10"/>
+                                <w:sz w:val="32"/>
+                                <w:szCs w:val="32"/>
+                                <w:cs/>
+                              </w:rPr>
+                              <w:t>ผอ</w:t>
+                            </w:r>
+                            <w:proofErr w:type="spellEnd"/>
+                            <w:r>
+                              <w:rPr>
+                                <w:rFonts w:ascii="TH SarabunIT๙" w:hAnsi="TH SarabunIT๙" w:cs="TH SarabunIT๙"/>
+                                <w:spacing w:val="-10"/>
+                                <w:sz w:val="32"/>
+                                <w:szCs w:val="32"/>
+                              </w:rPr>
+                              <w:t>}{</w:t>
+                            </w:r>
+                            <w:r>
+                              <w:rPr>
+                                <w:rFonts w:ascii="TH SarabunIT๙" w:hAnsi="TH SarabunIT๙" w:cs="TH SarabunIT๙" w:hint="cs"/>
+                                <w:spacing w:val="-10"/>
+                                <w:sz w:val="32"/>
+                                <w:szCs w:val="32"/>
+                                <w:cs/>
+                              </w:rPr>
+                              <w:t>ชื่อ</w:t>
+                            </w:r>
+                            <w:proofErr w:type="spellStart"/>
+                            <w:r>
+                              <w:rPr>
+                                <w:rFonts w:ascii="TH SarabunIT๙" w:hAnsi="TH SarabunIT๙" w:cs="TH SarabunIT๙" w:hint="cs"/>
+                                <w:spacing w:val="-10"/>
+                                <w:sz w:val="32"/>
+                                <w:szCs w:val="32"/>
+                                <w:cs/>
+                              </w:rPr>
+                              <w:t>ผอ</w:t>
+                            </w:r>
+                            <w:proofErr w:type="spellEnd"/>
+                            <w:r>
+                              <w:rPr>
+                                <w:rFonts w:ascii="TH SarabunIT๙" w:hAnsi="TH SarabunIT๙" w:cs="TH SarabunIT๙"/>
+                                <w:spacing w:val="-10"/>
+                                <w:sz w:val="32"/>
+                                <w:szCs w:val="32"/>
+                              </w:rPr>
+                              <w:t>}</w:t>
+                            </w:r>
+                            <w:r>
+                              <w:rPr>
+                                <w:rFonts w:ascii="TH SarabunIT๙" w:hAnsi="TH SarabunIT๙" w:cs="TH SarabunIT๙" w:hint="cs"/>
+                                <w:spacing w:val="-10"/>
+                                <w:sz w:val="32"/>
+                                <w:szCs w:val="32"/>
+                                <w:cs/>
+                              </w:rPr>
+                              <w:t xml:space="preserve"> </w:t>
+                            </w:r>
+                            <w:r>
+                              <w:rPr>
+                                <w:rFonts w:ascii="TH SarabunIT๙" w:hAnsi="TH SarabunIT๙" w:cs="TH SarabunIT๙"/>
+                                <w:spacing w:val="-10"/>
+                                <w:sz w:val="32"/>
+                                <w:szCs w:val="32"/>
+                              </w:rPr>
+                              <w:t>{</w:t>
+                            </w:r>
+                            <w:r>
+                              <w:rPr>
+                                <w:rFonts w:ascii="TH SarabunIT๙" w:hAnsi="TH SarabunIT๙" w:cs="TH SarabunIT๙" w:hint="cs"/>
+                                <w:spacing w:val="-10"/>
+                                <w:sz w:val="32"/>
+                                <w:szCs w:val="32"/>
+                                <w:cs/>
+                              </w:rPr>
+                              <w:t>นามสกุล</w:t>
+                            </w:r>
+                            <w:proofErr w:type="spellStart"/>
+                            <w:r>
+                              <w:rPr>
+                                <w:rFonts w:ascii="TH SarabunIT๙" w:hAnsi="TH SarabunIT๙" w:cs="TH SarabunIT๙" w:hint="cs"/>
+                                <w:spacing w:val="-10"/>
+                                <w:sz w:val="32"/>
+                                <w:szCs w:val="32"/>
+                                <w:cs/>
+                              </w:rPr>
+                              <w:t>ผอ</w:t>
+                            </w:r>
+                            <w:proofErr w:type="spellEnd"/>
+                            <w:r>
+                              <w:rPr>
+                                <w:rFonts w:ascii="TH SarabunIT๙" w:hAnsi="TH SarabunIT๙" w:cs="TH SarabunIT๙"/>
+                                <w:spacing w:val="-10"/>
+                                <w:sz w:val="32"/>
+                                <w:szCs w:val="32"/>
+                              </w:rPr>
+                              <w:t>}</w:t>
+                            </w:r>
+                            <w:r>
+                              <w:rPr>
+                                <w:rFonts w:ascii="TH SarabunIT๙" w:hAnsi="TH SarabunIT๙" w:cs="TH SarabunIT๙" w:hint="cs"/>
+                                <w:spacing w:val="-10"/>
+                                <w:sz w:val="32"/>
+                                <w:szCs w:val="32"/>
+                                <w:cs/>
+                              </w:rPr>
+                              <w:t>)</w:t>
+                            </w:r>
+                          </w:p>
+                          <w:p>
+                            <w:pPr>
+                              <w:jc w:val="center"/>
+                              <w:rPr>
+                                <w:rFonts w:ascii="TH SarabunIT๙" w:hAnsi="TH SarabunIT๙" w:cs="TH SarabunIT๙"/>
+                                <w:sz w:val="32"/>
+                                <w:szCs w:val="32"/>
+                                <w:cs/>
+                              </w:rPr>
+                            </w:pPr>
+                            <w:r>
+                              <w:rPr>
+                                <w:rFonts w:ascii="TH SarabunIT๙" w:hAnsi="TH SarabunIT๙" w:cs="TH SarabunIT๙" w:hint="cs"/>
+                                <w:spacing w:val="-10"/>
+                                <w:sz w:val="32"/>
+                                <w:szCs w:val="32"/>
+                                <w:cs/>
+                              </w:rPr>
+                              <w:t>ผู้อำนวยการ</w:t>
+                            </w:r>
+                            <w:r>
+                              <w:rPr>
+                                <w:rFonts w:ascii="TH SarabunIT๙" w:hAnsi="TH SarabunIT๙" w:cs="TH SarabunIT๙"/>
+                                <w:spacing w:val="-10"/>
+                                <w:sz w:val="32"/>
+                                <w:szCs w:val="32"/>
+                              </w:rPr>
+                              <w:t>{</w:t>
+                            </w:r>
+                            <w:r>
+                              <w:rPr>
+                                <w:rFonts w:ascii="TH SarabunIT๙" w:hAnsi="TH SarabunIT๙" w:cs="TH SarabunIT๙" w:hint="cs"/>
+                                <w:spacing w:val="-10"/>
+                                <w:sz w:val="32"/>
+                                <w:szCs w:val="32"/>
+                                <w:cs/>
+                              </w:rPr>
+                              <w:t>ชื่อโรงเรียน</w:t>
+                            </w:r>
+                            <w:r>
+                              <w:rPr>
+                                <w:rFonts w:ascii="TH SarabunIT๙" w:hAnsi="TH SarabunIT๙" w:cs="TH SarabunIT๙"/>
+                                <w:spacing w:val="-10"/>
+                                <w:sz w:val="32"/>
+                                <w:szCs w:val="32"/>
+                              </w:rPr>
+                              <w:t>}</w:t>
+                            </w:r>
+                          </w:p>
+                          <w:p/>
+                          <w:p/>
+                        </w:txbxContent>
+                      </wps:txbx>
+                      <wps:bodyPr rot="0" vert="horz" wrap="square" lIns="91440" tIns="45720" rIns="91440" bIns="45720" anchor="t" anchorCtr="0" upright="1">
+                        <a:noAutofit/>
+                      </wps:bodyPr>
+                    </wps:wsp>
+                  </a:graphicData>
+                </a:graphic>
+                <wp14:sizeRelH relativeFrom="margin">
+                  <wp14:pctWidth>0</wp14:pctWidth>
+                </wp14:sizeRelH>
+                <wp14:sizeRelV relativeFrom="margin">
+                  <wp14:pctHeight>0</wp14:pctHeight>
+                </wp14:sizeRelV>
+              </wp:anchor>
+            </w:drawing>
+          </mc:Choice>
+          <mc:Fallback>
+            <w:pict>
+              <v:shapetype w14:anchorId="200C72C2" id="_x0000_t202" coordsize="21600,21600" o:spt="202" path="m,l,21600r21600,l21600,xe">
+                <v:stroke joinstyle="miter"/>
+                <v:path gradientshapeok="t" o:connecttype="rect"/>
+              </v:shapetype>
+              <v:shape id="Text Box 2" o:spid="_x0000_s1026" type="#_x0000_t202" style="position:absolute;left:0;text-align:left;margin-left:259.2pt;margin-top:11.25pt;width:207.65pt;height:171.75pt;z-index:251659264;visibility:visible;mso-wrap-style:square;mso-width-percent:0;mso-height-percent:0;mso-wrap-distance-left:9pt;mso-wrap-distance-top:3.6pt;mso-wrap-distance-right:9pt;mso-wrap-distance-bottom:3.6pt;mso-position-horizontal:absolute;mso-position-horizontal-relative:text;mso-position-vertical:absolute;mso-position-vertical-relative:text;mso-width-percent:0;mso-height-percent:0;mso-width-relative:margin;mso-height-relative:margin;v-text-anchor:top" o:gfxdata="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">
+                <v:textbox>
+                  <w:txbxContent>
+                    <w:p>
+                      <w:pPr>
+                        <w:rPr>
+                          <w:rFonts w:ascii="TH SarabunIT๙" w:hAnsi="TH SarabunIT๙" w:cs="TH SarabunIT๙"/>
+                          <w:spacing w:val="-10"/>
+                          <w:sz w:val="32"/>
+                          <w:szCs w:val="32"/>
+                        </w:rPr>
+                      </w:pPr>
+                      <w:r>
+                        <w:rPr>
+                          <w:rFonts w:ascii="TH SarabunIT๙" w:hAnsi="TH SarabunIT๙" w:cs="TH SarabunIT๙"/>
+                          <w:spacing w:val="-10"/>
+                          <w:sz w:val="32"/>
+                          <w:szCs w:val="32"/>
+                          <w:cs/>
+                        </w:rPr>
+                        <w:t>(   ) ทราบ/เห็นชอบ</w:t>
+                      </w:r>
+                    </w:p>
+                    <w:p>
+                      <w:pPr>
+                        <w:rPr>
+                          <w:rFonts w:ascii="TH SarabunIT๙" w:hAnsi="TH SarabunIT๙" w:cs="TH SarabunIT๙"/>
+                          <w:spacing w:val="-10"/>
+                          <w:sz w:val="32"/>
+                          <w:szCs w:val="32"/>
+                        </w:rPr>
+                      </w:pPr>
+                      <w:r>
+                        <w:rPr>
+                          <w:rFonts w:ascii="TH SarabunIT๙" w:hAnsi="TH SarabunIT๙" w:cs="TH SarabunIT๙"/>
+                          <w:spacing w:val="-10"/>
+                          <w:sz w:val="32"/>
+                          <w:szCs w:val="32"/>
+                          <w:cs/>
+                        </w:rPr>
+                        <w:t>(   ) อนุมัติ</w:t>
+                      </w:r>
+                      <w:r>
+                        <w:rPr>
+                          <w:rFonts w:ascii="TH SarabunIT๙" w:hAnsi="TH SarabunIT๙" w:cs="TH SarabunIT๙" w:hint="cs"/>
+                          <w:spacing w:val="-10"/>
+                          <w:sz w:val="32"/>
+                          <w:szCs w:val="32"/>
+                          <w:cs/>
+                        </w:rPr>
+                        <w:t>ดำเนินการ</w:t>
+                      </w:r>
+                    </w:p>
+                    <w:p>
+                      <w:pPr>
+                        <w:rPr>
+                          <w:rFonts w:ascii="TH SarabunIT๙" w:hAnsi="TH SarabunIT๙" w:cs="TH SarabunIT๙"/>
+                          <w:spacing w:val="-10"/>
+                          <w:sz w:val="32"/>
+                          <w:szCs w:val="32"/>
+                        </w:rPr>
+                      </w:pPr>
+                      <w:r>
+                        <w:rPr>
+                          <w:rFonts w:ascii="TH SarabunIT๙" w:hAnsi="TH SarabunIT๙" w:cs="TH SarabunIT๙"/>
+                          <w:spacing w:val="-10"/>
+                          <w:sz w:val="32"/>
+                          <w:szCs w:val="32"/>
+                          <w:cs/>
+                        </w:rPr>
+                        <w:t>(   ) ....................................................................</w:t>
+                      </w:r>
+                    </w:p>
+                    <w:p>
+                      <w:pPr>
+                        <w:rPr>
+                          <w:rFonts w:ascii="TH SarabunIT๙" w:hAnsi="TH SarabunIT๙" w:cs="TH SarabunIT๙"/>
+                          <w:spacing w:val="-10"/>
+                        </w:rPr>
+                      </w:pPr>
+                    </w:p>
+                    <w:p>
+                      <w:pPr>
+                        <w:rPr>
+                          <w:rFonts w:ascii="TH SarabunIT๙" w:hAnsi="TH SarabunIT๙" w:cs="TH SarabunIT๙"/>
+                          <w:spacing w:val="-10"/>
+                        </w:rPr>
+                      </w:pPr>
+                    </w:p>
+                    <w:p>
+                      <w:pPr>
+                        <w:rPr>
+                          <w:rFonts w:ascii="TH SarabunIT๙" w:hAnsi="TH SarabunIT๙" w:cs="TH SarabunIT๙"/>
+                          <w:spacing w:val="-10"/>
+                        </w:rPr>
+                      </w:pPr>
+                    </w:p>
+                    <w:p>
+                      <w:pPr>
+                        <w:jc w:val="center"/>
+                        <w:rPr>
+                          <w:rFonts w:ascii="TH SarabunIT๙" w:hAnsi="TH SarabunIT๙" w:cs="TH SarabunIT๙"/>
+                          <w:spacing w:val="-10"/>
+                          <w:sz w:val="32"/>
+                          <w:szCs w:val="32"/>
+                        </w:rPr>
+                      </w:pPr>
+                      <w:r>
+                        <w:rPr>
+                          <w:rFonts w:ascii="TH SarabunIT๙" w:hAnsi="TH SarabunIT๙" w:cs="TH SarabunIT๙" w:hint="cs"/>
+                          <w:spacing w:val="-10"/>
+                          <w:sz w:val="32"/>
+                          <w:szCs w:val="32"/>
+                          <w:cs/>
+                        </w:rPr>
+                        <w:t>(</w:t>
+                      </w:r>
+                      <w:r>
+                        <w:rPr>
+                          <w:rFonts w:ascii="TH SarabunIT๙" w:hAnsi="TH SarabunIT๙" w:cs="TH SarabunIT๙"/>
+                          <w:spacing w:val="-10"/>
+                          <w:sz w:val="32"/>
+                          <w:szCs w:val="32"/>
+                        </w:rPr>
+                        <w:t>{</w:t>
+                      </w:r>
+                      <w:r>
+                        <w:rPr>
+                          <w:rFonts w:ascii="TH SarabunIT๙" w:hAnsi="TH SarabunIT๙" w:cs="TH SarabunIT๙" w:hint="cs"/>
+                          <w:spacing w:val="-10"/>
+                          <w:sz w:val="32"/>
+                          <w:szCs w:val="32"/>
+                          <w:cs/>
+                        </w:rPr>
+                        <w:t>คำนำหน้า</w:t>
+                      </w:r>
+                      <w:proofErr w:type="spellStart"/>
+                      <w:r>
+                        <w:rPr>
+                          <w:rFonts w:ascii="TH SarabunIT๙" w:hAnsi="TH SarabunIT๙" w:cs="TH SarabunIT๙" w:hint="cs"/>
+                          <w:spacing w:val="-10"/>
+                          <w:sz w:val="32"/>
+                          <w:szCs w:val="32"/>
+                          <w:cs/>
+                        </w:rPr>
+                        <w:t>ผอ</w:t>
+                      </w:r>
+                      <w:proofErr w:type="spellEnd"/>
+                      <w:r>
+                        <w:rPr>
+                          <w:rFonts w:ascii="TH SarabunIT๙" w:hAnsi="TH SarabunIT๙" w:cs="TH SarabunIT๙"/>
+                          <w:spacing w:val="-10"/>
+                          <w:sz w:val="32"/>
+                          <w:szCs w:val="32"/>
+                        </w:rPr>
+                        <w:t>}{</w:t>
+                      </w:r>
+                      <w:r>
+                        <w:rPr>
+                          <w:rFonts w:ascii="TH SarabunIT๙" w:hAnsi="TH SarabunIT๙" w:cs="TH SarabunIT๙" w:hint="cs"/>
+                          <w:spacing w:val="-10"/>
+                          <w:sz w:val="32"/>
+                          <w:szCs w:val="32"/>
+                          <w:cs/>
+                        </w:rPr>
+                        <w:t>ชื่อ</w:t>
+                      </w:r>
+                      <w:proofErr w:type="spellStart"/>
+                      <w:r>
+                        <w:rPr>
+                          <w:rFonts w:ascii="TH SarabunIT๙" w:hAnsi="TH SarabunIT๙" w:cs="TH SarabunIT๙" w:hint="cs"/>
+                          <w:spacing w:val="-10"/>
+                          <w:sz w:val="32"/>
+                          <w:szCs w:val="32"/>
+                          <w:cs/>
+                        </w:rPr>
+                        <w:t>ผอ</w:t>
+                      </w:r>
+                      <w:proofErr w:type="spellEnd"/>
+                      <w:r>
+                        <w:rPr>
+                          <w:rFonts w:ascii="TH SarabunIT๙" w:hAnsi="TH SarabunIT๙" w:cs="TH SarabunIT๙"/>
+                          <w:spacing w:val="-10"/>
+                          <w:sz w:val="32"/>
+                          <w:szCs w:val="32"/>
+                        </w:rPr>
+                        <w:t>}</w:t>
+                      </w:r>
+                      <w:r>
+                        <w:rPr>
+                          <w:rFonts w:ascii="TH SarabunIT๙" w:hAnsi="TH SarabunIT๙" w:cs="TH SarabunIT๙" w:hint="cs"/>
+                          <w:spacing w:val="-10"/>
+                          <w:sz w:val="32"/>
+                          <w:szCs w:val="32"/>
+                          <w:cs/>
+                        </w:rPr>
+                        <w:t xml:space="preserve"> </w:t>
+                      </w:r>
+                      <w:r>
+                        <w:rPr>
+                          <w:rFonts w:ascii="TH SarabunIT๙" w:hAnsi="TH SarabunIT๙" w:cs="TH SarabunIT๙"/>
+                          <w:spacing w:val="-10"/>
+                          <w:sz w:val="32"/>
+                          <w:szCs w:val="32"/>
+                        </w:rPr>
+                        <w:t>{</w:t>
+                      </w:r>
+                      <w:r>
+                        <w:rPr>
+                          <w:rFonts w:ascii="TH SarabunIT๙" w:hAnsi="TH SarabunIT๙" w:cs="TH SarabunIT๙" w:hint="cs"/>
+                          <w:spacing w:val="-10"/>
+                          <w:sz w:val="32"/>
+                          <w:szCs w:val="32"/>
+                          <w:cs/>
+                        </w:rPr>
+                        <w:t>นามสกุล</w:t>
+                      </w:r>
+                      <w:proofErr w:type="spellStart"/>
+                      <w:r>
+                        <w:rPr>
+                          <w:rFonts w:ascii="TH SarabunIT๙" w:hAnsi="TH SarabunIT๙" w:cs="TH SarabunIT๙" w:hint="cs"/>
+                          <w:spacing w:val="-10"/>
+                          <w:sz w:val="32"/>
+                          <w:szCs w:val="32"/>
+                          <w:cs/>
+                        </w:rPr>
+                        <w:t>ผอ</w:t>
+                      </w:r>
+                      <w:proofErr w:type="spellEnd"/>
+                      <w:r>
+                        <w:rPr>
+                          <w:rFonts w:ascii="TH SarabunIT๙" w:hAnsi="TH SarabunIT๙" w:cs="TH SarabunIT๙"/>
+                          <w:spacing w:val="-10"/>
+                          <w:sz w:val="32"/>
+                          <w:szCs w:val="32"/>
+                        </w:rPr>
+                        <w:t>}</w:t>
+                      </w:r>
+                      <w:r>
+                        <w:rPr>
+                          <w:rFonts w:ascii="TH SarabunIT๙" w:hAnsi="TH SarabunIT๙" w:cs="TH SarabunIT๙" w:hint="cs"/>
+                          <w:spacing w:val="-10"/>
+                          <w:sz w:val="32"/>
+                          <w:szCs w:val="32"/>
+                          <w:cs/>
+                        </w:rPr>
+                        <w:t>)</w:t>
+                      </w:r>
+                    </w:p>
+                    <w:p>
+                      <w:pPr>
+                        <w:jc w:val="center"/>
+                        <w:rPr>
+                          <w:rFonts w:ascii="TH SarabunIT๙" w:hAnsi="TH SarabunIT๙" w:cs="TH SarabunIT๙"/>
+                          <w:sz w:val="32"/>
+                          <w:szCs w:val="32"/>
+                          <w:cs/>
+                        </w:rPr>
+                      </w:pPr>
+                      <w:r>
+                        <w:rPr>
+                          <w:rFonts w:ascii="TH SarabunIT๙" w:hAnsi="TH SarabunIT๙" w:cs="TH SarabunIT๙" w:hint="cs"/>
+                          <w:spacing w:val="-10"/>
+                          <w:sz w:val="32"/>
+                          <w:szCs w:val="32"/>
+                          <w:cs/>
+                        </w:rPr>
+                        <w:t>ผู้อำนวยการ</w:t>
+                      </w:r>
+                      <w:r>
+                        <w:rPr>
+                          <w:rFonts w:ascii="TH SarabunIT๙" w:hAnsi="TH SarabunIT๙" w:cs="TH SarabunIT๙"/>
+                          <w:spacing w:val="-10"/>
+                          <w:sz w:val="32"/>
+                          <w:szCs w:val="32"/>
+                        </w:rPr>
+                        <w:t>{</w:t>
+                      </w:r>
+                      <w:r>
+                        <w:rPr>
+                          <w:rFonts w:ascii="TH SarabunIT๙" w:hAnsi="TH SarabunIT๙" w:cs="TH SarabunIT๙" w:hint="cs"/>
+                          <w:spacing w:val="-10"/>
+                          <w:sz w:val="32"/>
+                          <w:szCs w:val="32"/>
+                          <w:cs/>
+                        </w:rPr>
+                        <w:t>ชื่อโรงเรียน</w:t>
+                      </w:r>
+                      <w:r>
+                        <w:rPr>
+                          <w:rFonts w:ascii="TH SarabunIT๙" w:hAnsi="TH SarabunIT๙" w:cs="TH SarabunIT๙"/>
+                          <w:spacing w:val="-10"/>
+                          <w:sz w:val="32"/>
+                          <w:szCs w:val="32"/>
+                        </w:rPr>
+                        <w:t>}</w:t>
+                      </w:r>
+                    </w:p>
+                    <w:p/>
+                    <w:p/>
+                  </w:txbxContent>
+                </v:textbox>
+                <w10:wrap type="square"/>
+              </v:shape>
+            </w:pict>
+          </mc:Fallback>
+        </mc:AlternateContent>
+      </w:r>
     </w:p>
     <w:p>
       <w:pPr>
         <w:rPr>
-          <w:rFonts w:ascii="TH SarabunIT๙" w:eastAsia="Times New Roman" w:hAnsi="TH SarabunIT๙" w:cs="TH SarabunIT๙" w:hint="cs"/>
+          <w:rFonts w:ascii="TH SarabunIT๙" w:eastAsia="Times New Roman" w:hAnsi="TH SarabunIT๙" w:cs="TH SarabunIT๙"/>
         </w:rPr>
       </w:pPr>
       <w:r>
@@ -1681,7 +2379,7 @@
         <mc:AlternateContent>
           <mc:Choice Requires="wps">
             <w:drawing>
-              <wp:anchor distT="45720" distB="45720" distL="114300" distR="114300" simplePos="0" relativeHeight="251657216" behindDoc="0" locked="0" layoutInCell="1" allowOverlap="1" wp14:anchorId="42A71CE6" wp14:editId="23B84456">
+              <wp:anchor distT="45720" distB="45720" distL="114300" distR="114300" simplePos="0" relativeHeight="251657216" behindDoc="0" locked="0" layoutInCell="1" allowOverlap="1" wp14:anchorId="42A71CE6" wp14:editId="0024F486">
                 <wp:simplePos x="0" y="0"/>
                 <wp:positionH relativeFrom="column">
                   <wp:posOffset>4445</wp:posOffset>
@@ -1911,7 +2609,7 @@
           </mc:Choice>
           <mc:Fallback>
             <w:pict>
-              <v:shape w14:anchorId="42A71CE6" id="_x0000_s1027" type="#_x0000_t202" style="position:absolute;margin-left:.35pt;margin-top:25.4pt;width:207.65pt;height:47pt;z-index:251657216;visibility:visible;mso-wrap-style:square;mso-width-percent:0;mso-height-percent:0;mso-wrap-distance-left:9pt;mso-wrap-distance-top:3.6pt;mso-wrap-distance-right:9pt;mso-wrap-distance-bottom:3.6pt;mso-position-horizontal:absolute;mso-position-horizontal-relative:text;mso-position-vertical:absolute;mso-position-vertical-relative:text;mso-width-percent:0;mso-height-percent:0;mso-width-relative:margin;mso-height-relative:margin;v-text-anchor:top" o:gfxdata="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" stroked="f">
+              <v:shape w14:anchorId="42A71CE6" id="_x0000_s1028" type="#_x0000_t202" style="position:absolute;margin-left:.35pt;margin-top:25.4pt;width:207.65pt;height:47pt;z-index:251657216;visibility:visible;mso-wrap-style:square;mso-width-percent:0;mso-height-percent:0;mso-wrap-distance-left:9pt;mso-wrap-distance-top:3.6pt;mso-wrap-distance-right:9pt;mso-wrap-distance-bottom:3.6pt;mso-position-horizontal:absolute;mso-position-horizontal-relative:text;mso-position-vertical:absolute;mso-position-vertical-relative:text;mso-width-percent:0;mso-height-percent:0;mso-width-relative:margin;mso-height-relative:margin;v-text-anchor:top" o:gfxdata="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" stroked="f">
                 <v:textbox>
                   <w:txbxContent>
                     <w:p>
@@ -2071,608 +2769,6 @@
                           <w:cs/>
                         </w:rPr>
                         <w:t>เจ้าหน้าที่</w:t>
-                      </w:r>
-                    </w:p>
-                    <w:p/>
-                    <w:p/>
-                  </w:txbxContent>
-                </v:textbox>
-                <w10:wrap type="square"/>
-              </v:shape>
-            </w:pict>
-          </mc:Fallback>
-        </mc:AlternateContent>
-      </w:r>
-      <w:r>
-        <w:rPr>
-          <w:noProof/>
-        </w:rPr>
-        <mc:AlternateContent>
-          <mc:Choice Requires="wps">
-            <w:drawing>
-              <wp:anchor distT="45720" distB="45720" distL="114300" distR="114300" simplePos="0" relativeHeight="251659264" behindDoc="0" locked="0" layoutInCell="1" allowOverlap="1" wp14:anchorId="200C72C2" wp14:editId="63E00FBA">
-                <wp:simplePos x="0" y="0"/>
-                <wp:positionH relativeFrom="column">
-                  <wp:posOffset>3290570</wp:posOffset>
-                </wp:positionH>
-                <wp:positionV relativeFrom="paragraph">
-                  <wp:posOffset>246380</wp:posOffset>
-                </wp:positionV>
-                <wp:extent cx="2637155" cy="1892300"/>
-                <wp:effectExtent l="0" t="0" r="0" b="0"/>
-                <wp:wrapSquare wrapText="bothSides"/>
-                <wp:docPr id="936539965" name="Text Box 2"/>
-                <wp:cNvGraphicFramePr>
-                  <a:graphicFrameLocks xmlns:a="http://schemas.openxmlformats.org/drawingml/2006/main"/>
-                </wp:cNvGraphicFramePr>
-                <a:graphic xmlns:a="http://schemas.openxmlformats.org/drawingml/2006/main">
-                  <a:graphicData uri="http://schemas.microsoft.com/office/word/2010/wordprocessingShape">
-                    <wps:wsp>
-                      <wps:cNvSpPr txBox="1">
-                        <a:spLocks noChangeArrowheads="1"/>
-                      </wps:cNvSpPr>
-                      <wps:spPr bwMode="auto">
-                        <a:xfrm>
-                          <a:off x="0" y="0"/>
-                          <a:ext cx="2637155" cy="1892300"/>
-                        </a:xfrm>
-                        <a:prstGeom prst="rect">
-                          <a:avLst/>
-                        </a:prstGeom>
-                        <a:solidFill>
-                          <a:srgbClr val="FFFFFF"/>
-                        </a:solidFill>
-                        <a:ln w="9525">
-                          <a:solidFill>
-                            <a:srgbClr val="000000"/>
-                          </a:solidFill>
-                          <a:miter lim="800000"/>
-                          <a:headEnd/>
-                          <a:tailEnd/>
-                        </a:ln>
-                      </wps:spPr>
-                      <wps:txbx>
-                        <w:txbxContent>
-                          <w:p>
-                            <w:pPr>
-                              <w:rPr>
-                                <w:rFonts w:ascii="TH SarabunIT๙" w:hAnsi="TH SarabunIT๙" w:cs="TH SarabunIT๙"/>
-                                <w:spacing w:val="-10"/>
-                                <w:sz w:val="32"/>
-                                <w:szCs w:val="32"/>
-                              </w:rPr>
-                            </w:pPr>
-                            <w:r>
-                              <w:rPr>
-                                <w:rFonts w:ascii="TH SarabunIT๙" w:hAnsi="TH SarabunIT๙" w:cs="TH SarabunIT๙"/>
-                                <w:spacing w:val="-10"/>
-                                <w:sz w:val="32"/>
-                                <w:szCs w:val="32"/>
-                                <w:cs/>
-                              </w:rPr>
-                              <w:t>(   ) ทราบ/เห็นชอบ</w:t>
-                            </w:r>
-                          </w:p>
-                          <w:p>
-                            <w:pPr>
-                              <w:rPr>
-                                <w:rFonts w:ascii="TH SarabunIT๙" w:hAnsi="TH SarabunIT๙" w:cs="TH SarabunIT๙"/>
-                                <w:spacing w:val="-10"/>
-                                <w:sz w:val="32"/>
-                                <w:szCs w:val="32"/>
-                              </w:rPr>
-                            </w:pPr>
-                            <w:r>
-                              <w:rPr>
-                                <w:rFonts w:ascii="TH SarabunIT๙" w:hAnsi="TH SarabunIT๙" w:cs="TH SarabunIT๙"/>
-                                <w:spacing w:val="-10"/>
-                                <w:sz w:val="32"/>
-                                <w:szCs w:val="32"/>
-                                <w:cs/>
-                              </w:rPr>
-                              <w:t>(   ) อนุมัติ</w:t>
-                            </w:r>
-                            <w:r>
-                              <w:rPr>
-                                <w:rFonts w:ascii="TH SarabunIT๙" w:hAnsi="TH SarabunIT๙" w:cs="TH SarabunIT๙" w:hint="cs"/>
-                                <w:spacing w:val="-10"/>
-                                <w:sz w:val="32"/>
-                                <w:szCs w:val="32"/>
-                                <w:cs/>
-                              </w:rPr>
-                              <w:t>ดำเนินการ</w:t>
-                            </w:r>
-                          </w:p>
-                          <w:p>
-                            <w:pPr>
-                              <w:rPr>
-                                <w:rFonts w:ascii="TH SarabunIT๙" w:hAnsi="TH SarabunIT๙" w:cs="TH SarabunIT๙"/>
-                                <w:spacing w:val="-10"/>
-                                <w:sz w:val="32"/>
-                                <w:szCs w:val="32"/>
-                              </w:rPr>
-                            </w:pPr>
-                            <w:r>
-                              <w:rPr>
-                                <w:rFonts w:ascii="TH SarabunIT๙" w:hAnsi="TH SarabunIT๙" w:cs="TH SarabunIT๙"/>
-                                <w:spacing w:val="-10"/>
-                                <w:sz w:val="32"/>
-                                <w:szCs w:val="32"/>
-                                <w:cs/>
-                              </w:rPr>
-                              <w:t>(   ) ....................................................................</w:t>
-                            </w:r>
-                          </w:p>
-                          <w:p>
-                            <w:pPr>
-                              <w:rPr>
-                                <w:rFonts w:ascii="TH SarabunIT๙" w:hAnsi="TH SarabunIT๙" w:cs="TH SarabunIT๙"/>
-                                <w:spacing w:val="-10"/>
-                              </w:rPr>
-                            </w:pPr>
-                          </w:p>
-                          <w:p>
-                            <w:pPr>
-                              <w:rPr>
-                                <w:rFonts w:ascii="TH SarabunIT๙" w:hAnsi="TH SarabunIT๙" w:cs="TH SarabunIT๙"/>
-                                <w:spacing w:val="-10"/>
-                              </w:rPr>
-                            </w:pPr>
-                          </w:p>
-                          <w:p>
-                            <w:pPr>
-                              <w:rPr>
-                                <w:rFonts w:ascii="TH SarabunIT๙" w:hAnsi="TH SarabunIT๙" w:cs="TH SarabunIT๙" w:hint="cs"/>
-                                <w:spacing w:val="-10"/>
-                              </w:rPr>
-                            </w:pPr>
-                          </w:p>
-                          <w:p>
-                            <w:pPr>
-                              <w:jc w:val="center"/>
-                              <w:rPr>
-                                <w:rFonts w:ascii="TH SarabunIT๙" w:hAnsi="TH SarabunIT๙" w:cs="TH SarabunIT๙"/>
-                                <w:spacing w:val="-10"/>
-                                <w:sz w:val="32"/>
-                                <w:szCs w:val="32"/>
-                              </w:rPr>
-                            </w:pPr>
-                            <w:r>
-                              <w:rPr>
-                                <w:rFonts w:ascii="TH SarabunIT๙" w:hAnsi="TH SarabunIT๙" w:cs="TH SarabunIT๙" w:hint="cs"/>
-                                <w:spacing w:val="-10"/>
-                                <w:sz w:val="32"/>
-                                <w:szCs w:val="32"/>
-                                <w:cs/>
-                              </w:rPr>
-                              <w:t>(</w:t>
-                            </w:r>
-                            <w:r>
-                              <w:rPr>
-                                <w:rFonts w:ascii="TH SarabunIT๙" w:hAnsi="TH SarabunIT๙" w:cs="TH SarabunIT๙"/>
-                                <w:spacing w:val="-10"/>
-                                <w:sz w:val="32"/>
-                                <w:szCs w:val="32"/>
-                              </w:rPr>
-                              <w:t>{</w:t>
-                            </w:r>
-                            <w:r>
-                              <w:rPr>
-                                <w:rFonts w:ascii="TH SarabunIT๙" w:hAnsi="TH SarabunIT๙" w:cs="TH SarabunIT๙" w:hint="cs"/>
-                                <w:spacing w:val="-10"/>
-                                <w:sz w:val="32"/>
-                                <w:szCs w:val="32"/>
-                                <w:cs/>
-                              </w:rPr>
-                              <w:t>คำนำหน้าผอ</w:t>
-                            </w:r>
-                            <w:r>
-                              <w:rPr>
-                                <w:rFonts w:ascii="TH SarabunIT๙" w:hAnsi="TH SarabunIT๙" w:cs="TH SarabunIT๙"/>
-                                <w:spacing w:val="-10"/>
-                                <w:sz w:val="32"/>
-                                <w:szCs w:val="32"/>
-                              </w:rPr>
-                              <w:t>}{</w:t>
-                            </w:r>
-                            <w:r>
-                              <w:rPr>
-                                <w:rFonts w:ascii="TH SarabunIT๙" w:hAnsi="TH SarabunIT๙" w:cs="TH SarabunIT๙" w:hint="cs"/>
-                                <w:spacing w:val="-10"/>
-                                <w:sz w:val="32"/>
-                                <w:szCs w:val="32"/>
-                                <w:cs/>
-                              </w:rPr>
-                              <w:t>ชื่อผอ</w:t>
-                            </w:r>
-                            <w:r>
-                              <w:rPr>
-                                <w:rFonts w:ascii="TH SarabunIT๙" w:hAnsi="TH SarabunIT๙" w:cs="TH SarabunIT๙"/>
-                                <w:spacing w:val="-10"/>
-                                <w:sz w:val="32"/>
-                                <w:szCs w:val="32"/>
-                              </w:rPr>
-                              <w:t>}</w:t>
-                            </w:r>
-                            <w:r>
-                              <w:rPr>
-                                <w:rFonts w:ascii="TH SarabunIT๙" w:hAnsi="TH SarabunIT๙" w:cs="TH SarabunIT๙" w:hint="cs"/>
-                                <w:spacing w:val="-10"/>
-                                <w:sz w:val="32"/>
-                                <w:szCs w:val="32"/>
-                                <w:cs/>
-                              </w:rPr>
-                              <w:t xml:space="preserve"> </w:t>
-                            </w:r>
-                            <w:r>
-                              <w:rPr>
-                                <w:rFonts w:ascii="TH SarabunIT๙" w:hAnsi="TH SarabunIT๙" w:cs="TH SarabunIT๙"/>
-                                <w:spacing w:val="-10"/>
-                                <w:sz w:val="32"/>
-                                <w:szCs w:val="32"/>
-                              </w:rPr>
-                              <w:t>{</w:t>
-                            </w:r>
-                            <w:r>
-                              <w:rPr>
-                                <w:rFonts w:ascii="TH SarabunIT๙" w:hAnsi="TH SarabunIT๙" w:cs="TH SarabunIT๙" w:hint="cs"/>
-                                <w:spacing w:val="-10"/>
-                                <w:sz w:val="32"/>
-                                <w:szCs w:val="32"/>
-                                <w:cs/>
-                              </w:rPr>
-                              <w:t>นามสกุลผอ</w:t>
-                            </w:r>
-                            <w:r>
-                              <w:rPr>
-                                <w:rFonts w:ascii="TH SarabunIT๙" w:hAnsi="TH SarabunIT๙" w:cs="TH SarabunIT๙"/>
-                                <w:spacing w:val="-10"/>
-                                <w:sz w:val="32"/>
-                                <w:szCs w:val="32"/>
-                              </w:rPr>
-                              <w:t>}</w:t>
-                            </w:r>
-                            <w:r>
-                              <w:rPr>
-                                <w:rFonts w:ascii="TH SarabunIT๙" w:hAnsi="TH SarabunIT๙" w:cs="TH SarabunIT๙" w:hint="cs"/>
-                                <w:spacing w:val="-10"/>
-                                <w:sz w:val="32"/>
-                                <w:szCs w:val="32"/>
-                                <w:cs/>
-                              </w:rPr>
-                              <w:t>)</w:t>
-                            </w:r>
-                          </w:p>
-                          <w:p>
-                            <w:pPr>
-                              <w:jc w:val="center"/>
-                              <w:rPr>
-                                <w:rFonts w:ascii="TH SarabunIT๙" w:hAnsi="TH SarabunIT๙" w:cs="TH SarabunIT๙"/>
-                                <w:sz w:val="32"/>
-                                <w:szCs w:val="32"/>
-                                <w:cs/>
-                              </w:rPr>
-                            </w:pPr>
-                            <w:r>
-                              <w:rPr>
-                                <w:rFonts w:ascii="TH SarabunIT๙" w:hAnsi="TH SarabunIT๙" w:cs="TH SarabunIT๙" w:hint="cs"/>
-                                <w:spacing w:val="-10"/>
-                                <w:sz w:val="32"/>
-                                <w:szCs w:val="32"/>
-                                <w:cs/>
-                              </w:rPr>
-                              <w:t>ผู้อำนวยการ</w:t>
-                            </w:r>
-                            <w:r>
-                              <w:rPr>
-                                <w:rFonts w:ascii="TH SarabunIT๙" w:hAnsi="TH SarabunIT๙" w:cs="TH SarabunIT๙"/>
-                                <w:spacing w:val="-10"/>
-                                <w:sz w:val="32"/>
-                                <w:szCs w:val="32"/>
-                              </w:rPr>
-                              <w:t>{</w:t>
-                            </w:r>
-                            <w:r>
-                              <w:rPr>
-                                <w:rFonts w:ascii="TH SarabunIT๙" w:hAnsi="TH SarabunIT๙" w:cs="TH SarabunIT๙" w:hint="cs"/>
-                                <w:spacing w:val="-10"/>
-                                <w:sz w:val="32"/>
-                                <w:szCs w:val="32"/>
-                                <w:cs/>
-                              </w:rPr>
-                              <w:t>ชื่อโรงเรียน</w:t>
-                            </w:r>
-                            <w:r>
-                              <w:rPr>
-                                <w:rFonts w:ascii="TH SarabunIT๙" w:hAnsi="TH SarabunIT๙" w:cs="TH SarabunIT๙"/>
-                                <w:spacing w:val="-10"/>
-                                <w:sz w:val="32"/>
-                                <w:szCs w:val="32"/>
-                              </w:rPr>
-                              <w:t>}</w:t>
-                            </w:r>
-                          </w:p>
-                          <w:p/>
-                          <w:p/>
-                        </w:txbxContent>
-                      </wps:txbx>
-                      <wps:bodyPr rot="0" vert="horz" wrap="square" lIns="91440" tIns="45720" rIns="91440" bIns="45720" anchor="t" anchorCtr="0" upright="1">
-                        <a:noAutofit/>
-                      </wps:bodyPr>
-                    </wps:wsp>
-                  </a:graphicData>
-                </a:graphic>
-                <wp14:sizeRelH relativeFrom="margin">
-                  <wp14:pctWidth>0</wp14:pctWidth>
-                </wp14:sizeRelH>
-                <wp14:sizeRelV relativeFrom="margin">
-                  <wp14:pctHeight>0</wp14:pctHeight>
-                </wp14:sizeRelV>
-              </wp:anchor>
-            </w:drawing>
-          </mc:Choice>
-          <mc:Fallback>
-            <w:pict>
-              <v:shape w14:anchorId="200C72C2" id="_x0000_s1028" type="#_x0000_t202" style="position:absolute;margin-left:259.1pt;margin-top:19.4pt;width:207.65pt;height:149pt;z-index:251659264;visibility:visible;mso-wrap-style:square;mso-width-percent:0;mso-height-percent:0;mso-wrap-distance-left:9pt;mso-wrap-distance-top:3.6pt;mso-wrap-distance-right:9pt;mso-wrap-distance-bottom:3.6pt;mso-position-horizontal:absolute;mso-position-horizontal-relative:text;mso-position-vertical:absolute;mso-position-vertical-relative:text;mso-width-percent:0;mso-height-percent:0;mso-width-relative:margin;mso-height-relative:margin;v-text-anchor:top" o:gfxdata="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">
-                <v:textbox>
-                  <w:txbxContent>
-                    <w:p>
-                      <w:pPr>
-                        <w:rPr>
-                          <w:rFonts w:ascii="TH SarabunIT๙" w:hAnsi="TH SarabunIT๙" w:cs="TH SarabunIT๙"/>
-                          <w:spacing w:val="-10"/>
-                          <w:sz w:val="32"/>
-                          <w:szCs w:val="32"/>
-                        </w:rPr>
-                      </w:pPr>
-                      <w:r>
-                        <w:rPr>
-                          <w:rFonts w:ascii="TH SarabunIT๙" w:hAnsi="TH SarabunIT๙" w:cs="TH SarabunIT๙"/>
-                          <w:spacing w:val="-10"/>
-                          <w:sz w:val="32"/>
-                          <w:szCs w:val="32"/>
-                          <w:cs/>
-                        </w:rPr>
-                        <w:t>(   ) ทราบ/เห็นชอบ</w:t>
-                      </w:r>
-                    </w:p>
-                    <w:p>
-                      <w:pPr>
-                        <w:rPr>
-                          <w:rFonts w:ascii="TH SarabunIT๙" w:hAnsi="TH SarabunIT๙" w:cs="TH SarabunIT๙"/>
-                          <w:spacing w:val="-10"/>
-                          <w:sz w:val="32"/>
-                          <w:szCs w:val="32"/>
-                        </w:rPr>
-                      </w:pPr>
-                      <w:r>
-                        <w:rPr>
-                          <w:rFonts w:ascii="TH SarabunIT๙" w:hAnsi="TH SarabunIT๙" w:cs="TH SarabunIT๙"/>
-                          <w:spacing w:val="-10"/>
-                          <w:sz w:val="32"/>
-                          <w:szCs w:val="32"/>
-                          <w:cs/>
-                        </w:rPr>
-                        <w:t>(   ) อนุมัติ</w:t>
-                      </w:r>
-                      <w:r>
-                        <w:rPr>
-                          <w:rFonts w:ascii="TH SarabunIT๙" w:hAnsi="TH SarabunIT๙" w:cs="TH SarabunIT๙" w:hint="cs"/>
-                          <w:spacing w:val="-10"/>
-                          <w:sz w:val="32"/>
-                          <w:szCs w:val="32"/>
-                          <w:cs/>
-                        </w:rPr>
-                        <w:t>ดำเนินการ</w:t>
-                      </w:r>
-                    </w:p>
-                    <w:p>
-                      <w:pPr>
-                        <w:rPr>
-                          <w:rFonts w:ascii="TH SarabunIT๙" w:hAnsi="TH SarabunIT๙" w:cs="TH SarabunIT๙"/>
-                          <w:spacing w:val="-10"/>
-                          <w:sz w:val="32"/>
-                          <w:szCs w:val="32"/>
-                        </w:rPr>
-                      </w:pPr>
-                      <w:r>
-                        <w:rPr>
-                          <w:rFonts w:ascii="TH SarabunIT๙" w:hAnsi="TH SarabunIT๙" w:cs="TH SarabunIT๙"/>
-                          <w:spacing w:val="-10"/>
-                          <w:sz w:val="32"/>
-                          <w:szCs w:val="32"/>
-                          <w:cs/>
-                        </w:rPr>
-                        <w:t>(   ) ....................................................................</w:t>
-                      </w:r>
-                    </w:p>
-                    <w:p>
-                      <w:pPr>
-                        <w:rPr>
-                          <w:rFonts w:ascii="TH SarabunIT๙" w:hAnsi="TH SarabunIT๙" w:cs="TH SarabunIT๙"/>
-                          <w:spacing w:val="-10"/>
-                        </w:rPr>
-                      </w:pPr>
-                    </w:p>
-                    <w:p>
-                      <w:pPr>
-                        <w:rPr>
-                          <w:rFonts w:ascii="TH SarabunIT๙" w:hAnsi="TH SarabunIT๙" w:cs="TH SarabunIT๙"/>
-                          <w:spacing w:val="-10"/>
-                        </w:rPr>
-                      </w:pPr>
-                    </w:p>
-                    <w:p>
-                      <w:pPr>
-                        <w:rPr>
-                          <w:rFonts w:ascii="TH SarabunIT๙" w:hAnsi="TH SarabunIT๙" w:cs="TH SarabunIT๙" w:hint="cs"/>
-                          <w:spacing w:val="-10"/>
-                        </w:rPr>
-                      </w:pPr>
-                    </w:p>
-                    <w:p>
-                      <w:pPr>
-                        <w:jc w:val="center"/>
-                        <w:rPr>
-                          <w:rFonts w:ascii="TH SarabunIT๙" w:hAnsi="TH SarabunIT๙" w:cs="TH SarabunIT๙"/>
-                          <w:spacing w:val="-10"/>
-                          <w:sz w:val="32"/>
-                          <w:szCs w:val="32"/>
-                        </w:rPr>
-                      </w:pPr>
-                      <w:r>
-                        <w:rPr>
-                          <w:rFonts w:ascii="TH SarabunIT๙" w:hAnsi="TH SarabunIT๙" w:cs="TH SarabunIT๙" w:hint="cs"/>
-                          <w:spacing w:val="-10"/>
-                          <w:sz w:val="32"/>
-                          <w:szCs w:val="32"/>
-                          <w:cs/>
-                        </w:rPr>
-                        <w:t>(</w:t>
-                      </w:r>
-                      <w:r>
-                        <w:rPr>
-                          <w:rFonts w:ascii="TH SarabunIT๙" w:hAnsi="TH SarabunIT๙" w:cs="TH SarabunIT๙"/>
-                          <w:spacing w:val="-10"/>
-                          <w:sz w:val="32"/>
-                          <w:szCs w:val="32"/>
-                        </w:rPr>
-                        <w:t>{</w:t>
-                      </w:r>
-                      <w:r>
-                        <w:rPr>
-                          <w:rFonts w:ascii="TH SarabunIT๙" w:hAnsi="TH SarabunIT๙" w:cs="TH SarabunIT๙" w:hint="cs"/>
-                          <w:spacing w:val="-10"/>
-                          <w:sz w:val="32"/>
-                          <w:szCs w:val="32"/>
-                          <w:cs/>
-                        </w:rPr>
-                        <w:t>คำนำหน้าผอ</w:t>
-                      </w:r>
-                      <w:r>
-                        <w:rPr>
-                          <w:rFonts w:ascii="TH SarabunIT๙" w:hAnsi="TH SarabunIT๙" w:cs="TH SarabunIT๙"/>
-                          <w:spacing w:val="-10"/>
-                          <w:sz w:val="32"/>
-                          <w:szCs w:val="32"/>
-                        </w:rPr>
-                        <w:t>}{</w:t>
-                      </w:r>
-                      <w:r>
-                        <w:rPr>
-                          <w:rFonts w:ascii="TH SarabunIT๙" w:hAnsi="TH SarabunIT๙" w:cs="TH SarabunIT๙" w:hint="cs"/>
-                          <w:spacing w:val="-10"/>
-                          <w:sz w:val="32"/>
-                          <w:szCs w:val="32"/>
-                          <w:cs/>
-                        </w:rPr>
-                        <w:t>ชื่อผอ</w:t>
-                      </w:r>
-                      <w:r>
-                        <w:rPr>
-                          <w:rFonts w:ascii="TH SarabunIT๙" w:hAnsi="TH SarabunIT๙" w:cs="TH SarabunIT๙"/>
-                          <w:spacing w:val="-10"/>
-                          <w:sz w:val="32"/>
-                          <w:szCs w:val="32"/>
-                        </w:rPr>
-                        <w:t>}</w:t>
-                      </w:r>
-                      <w:r>
-                        <w:rPr>
-                          <w:rFonts w:ascii="TH SarabunIT๙" w:hAnsi="TH SarabunIT๙" w:cs="TH SarabunIT๙" w:hint="cs"/>
-                          <w:spacing w:val="-10"/>
-                          <w:sz w:val="32"/>
-                          <w:szCs w:val="32"/>
-                          <w:cs/>
-                        </w:rPr>
-                        <w:t xml:space="preserve"> </w:t>
-                      </w:r>
-                      <w:r>
-                        <w:rPr>
-                          <w:rFonts w:ascii="TH SarabunIT๙" w:hAnsi="TH SarabunIT๙" w:cs="TH SarabunIT๙"/>
-                          <w:spacing w:val="-10"/>
-                          <w:sz w:val="32"/>
-                          <w:szCs w:val="32"/>
-                        </w:rPr>
-                        <w:t>{</w:t>
-                      </w:r>
-                      <w:r>
-                        <w:rPr>
-                          <w:rFonts w:ascii="TH SarabunIT๙" w:hAnsi="TH SarabunIT๙" w:cs="TH SarabunIT๙" w:hint="cs"/>
-                          <w:spacing w:val="-10"/>
-                          <w:sz w:val="32"/>
-                          <w:szCs w:val="32"/>
-                          <w:cs/>
-                        </w:rPr>
-                        <w:t>นามสกุลผอ</w:t>
-                      </w:r>
-                      <w:r>
-                        <w:rPr>
-                          <w:rFonts w:ascii="TH SarabunIT๙" w:hAnsi="TH SarabunIT๙" w:cs="TH SarabunIT๙"/>
-                          <w:spacing w:val="-10"/>
-                          <w:sz w:val="32"/>
-                          <w:szCs w:val="32"/>
-                        </w:rPr>
-                        <w:t>}</w:t>
-                      </w:r>
-                      <w:r>
-                        <w:rPr>
-                          <w:rFonts w:ascii="TH SarabunIT๙" w:hAnsi="TH SarabunIT๙" w:cs="TH SarabunIT๙" w:hint="cs"/>
-                          <w:spacing w:val="-10"/>
-                          <w:sz w:val="32"/>
-                          <w:szCs w:val="32"/>
-                          <w:cs/>
-                        </w:rPr>
-                        <w:t>)</w:t>
-                      </w:r>
-                    </w:p>
-                    <w:p>
-                      <w:pPr>
-                        <w:jc w:val="center"/>
-                        <w:rPr>
-                          <w:rFonts w:ascii="TH SarabunIT๙" w:hAnsi="TH SarabunIT๙" w:cs="TH SarabunIT๙"/>
-                          <w:sz w:val="32"/>
-                          <w:szCs w:val="32"/>
-                          <w:cs/>
-                        </w:rPr>
-                      </w:pPr>
-                      <w:r>
-                        <w:rPr>
-                          <w:rFonts w:ascii="TH SarabunIT๙" w:hAnsi="TH SarabunIT๙" w:cs="TH SarabunIT๙" w:hint="cs"/>
-                          <w:spacing w:val="-10"/>
-                          <w:sz w:val="32"/>
-                          <w:szCs w:val="32"/>
-                          <w:cs/>
-                        </w:rPr>
-                        <w:t>ผู้อำนวยการ</w:t>
-                      </w:r>
-                      <w:r>
-                        <w:rPr>
-                          <w:rFonts w:ascii="TH SarabunIT๙" w:hAnsi="TH SarabunIT๙" w:cs="TH SarabunIT๙"/>
-                          <w:spacing w:val="-10"/>
-                          <w:sz w:val="32"/>
-                          <w:szCs w:val="32"/>
-                        </w:rPr>
-                        <w:t>{</w:t>
-                      </w:r>
-                      <w:r>
-                        <w:rPr>
-                          <w:rFonts w:ascii="TH SarabunIT๙" w:hAnsi="TH SarabunIT๙" w:cs="TH SarabunIT๙" w:hint="cs"/>
-                          <w:spacing w:val="-10"/>
-                          <w:sz w:val="32"/>
-                          <w:szCs w:val="32"/>
-                          <w:cs/>
-                        </w:rPr>
-                        <w:t>ชื่อโรงเรียน</w:t>
-                      </w:r>
-                      <w:r>
-                        <w:rPr>
-                          <w:rFonts w:ascii="TH SarabunIT๙" w:hAnsi="TH SarabunIT๙" w:cs="TH SarabunIT๙"/>
-                          <w:spacing w:val="-10"/>
-                          <w:sz w:val="32"/>
-                          <w:szCs w:val="32"/>
-                        </w:rPr>
-                        <w:t>}</w:t>
                       </w:r>
                     </w:p>
                     <w:p/>
@@ -2742,34 +2838,34 @@
 <w:hdr xmlns:wpc="http://schemas.microsoft.com/office/word/2010/wordprocessingCanvas" xmlns:cx="http://schemas.microsoft.com/office/drawing/2014/chartex" xmlns:cx1="http://schemas.microsoft.com/office/drawing/2015/9/8/chartex" xmlns:cx2="http://schemas.microsoft.com/office/drawing/2015/10/21/chartex" xmlns:cx3="http://schemas.microsoft.com/office/drawing/2016/5/9/chartex" xmlns:cx4="http://schemas.microsoft.com/office/drawing/2016/5/10/chartex" xmlns:cx5="http://schemas.microsoft.com/office/drawing/2016/5/11/chartex" xmlns:cx6="http://schemas.microsoft.com/office/drawing/2016/5/12/chartex" xmlns:cx7="http://schemas.microsoft.com/office/drawing/2016/5/13/chartex" xmlns:cx8="http://schemas.microsoft.com/office/drawing/2016/5/14/chartex" xmlns:mc="http://schemas.openxmlformats.org/markup-compatibility/2006" xmlns:aink="http://schemas.microsoft.com/office/drawing/2016/ink" xmlns:am3d="http://schemas.microsoft.com/office/drawing/2017/model3d" xmlns:o="urn:schemas-microsoft-com:office:office" xmlns:oel="http://schemas.microsoft.com/office/2019/extlst" xmlns:r="http://schemas.openxmlformats.org/officeDocument/2006/relationships" xmlns:m="http://schemas.openxmlformats.org/officeDocument/2006/math" xmlns:v="urn:schemas-microsoft-com:vml" xmlns:wp14="http://schemas.microsoft.com/office/word/2010/wordprocessingDrawing" xmlns:wp="http://schemas.openxmlformats.org/drawingml/2006/wordprocessingDrawing" xmlns:w10="urn:schemas-microsoft-com:office:word" xmlns:w="http://schemas.openxmlformats.org/wordprocessingml/2006/main" xmlns:w14="http://schemas.microsoft.com/office/word/2010/wordml" xmlns:w15="http://schemas.microsoft.com/office/word/2012/wordml" xmlns:w16cex="http://schemas.microsoft.com/office/word/2018/wordml/cex" xmlns:w16cid="http://schemas.microsoft.com/office/word/2016/wordml/cid" xmlns:w16="http://schemas.microsoft.com/office/word/2018/wordml" xmlns:w16du="http://schemas.microsoft.com/office/word/2023/wordml/word16du" xmlns:w16sdtdh="http://schemas.microsoft.com/office/word/2020/wordml/sdtdatahash" xmlns:w16sdtfl="http://schemas.microsoft.com/office/word/2024/wordml/sdtformatlock" xmlns:w16se="http://schemas.microsoft.com/office/word/2015/wordml/symex" xmlns:wpg="http://schemas.microsoft.com/office/word/2010/wordprocessingGroup" xmlns:wpi="http://schemas.microsoft.com/office/word/2010/wordprocessingInk" xmlns:wne="http://schemas.microsoft.com/office/word/2006/wordml" xmlns:wps="http://schemas.microsoft.com/office/word/2010/wordprocessingShape" mc:Ignorable="w14 w15 w16se w16cid w16 w16cex w16sdtdh w16sdtfl w16du wp14">
   <w:p>
     <w:pPr>
-      <w:pStyle w:val="a6"/>
+      <w:pStyle w:val="a7"/>
       <w:framePr w:wrap="around" w:vAnchor="text" w:hAnchor="margin" w:xAlign="right" w:y="1"/>
       <w:rPr>
-        <w:rStyle w:val="ab"/>
+        <w:rStyle w:val="ac"/>
       </w:rPr>
     </w:pPr>
     <w:r>
       <w:rPr>
-        <w:rStyle w:val="ab"/>
+        <w:rStyle w:val="ac"/>
       </w:rPr>
       <w:fldChar w:fldCharType="begin"/>
     </w:r>
     <w:r>
       <w:rPr>
-        <w:rStyle w:val="ab"/>
+        <w:rStyle w:val="ac"/>
       </w:rPr>
       <w:instrText xml:space="preserve">PAGE  </w:instrText>
     </w:r>
     <w:r>
       <w:rPr>
-        <w:rStyle w:val="ab"/>
+        <w:rStyle w:val="ac"/>
       </w:rPr>
       <w:fldChar w:fldCharType="end"/>
     </w:r>
   </w:p>
   <w:p>
     <w:pPr>
-      <w:pStyle w:val="a6"/>
+      <w:pStyle w:val="a7"/>
       <w:ind w:right="360"/>
     </w:pPr>
   </w:p>
@@ -2780,7 +2876,7 @@
 <w:hdr xmlns:wpc="http://schemas.microsoft.com/office/word/2010/wordprocessingCanvas" xmlns:cx="http://schemas.microsoft.com/office/drawing/2014/chartex" xmlns:cx1="http://schemas.microsoft.com/office/drawing/2015/9/8/chartex" xmlns:cx2="http://schemas.microsoft.com/office/drawing/2015/10/21/chartex" xmlns:cx3="http://schemas.microsoft.com/office/drawing/2016/5/9/chartex" xmlns:cx4="http://schemas.microsoft.com/office/drawing/2016/5/10/chartex" xmlns:cx5="http://schemas.microsoft.com/office/drawing/2016/5/11/chartex" xmlns:cx6="http://schemas.microsoft.com/office/drawing/2016/5/12/chartex" xmlns:cx7="http://schemas.microsoft.com/office/drawing/2016/5/13/chartex" xmlns:cx8="http://schemas.microsoft.com/office/drawing/2016/5/14/chartex" xmlns:mc="http://schemas.openxmlformats.org/markup-compatibility/2006" xmlns:aink="http://schemas.microsoft.com/office/drawing/2016/ink" xmlns:am3d="http://schemas.microsoft.com/office/drawing/2017/model3d" xmlns:o="urn:schemas-microsoft-com:office:office" xmlns:oel="http://schemas.microsoft.com/office/2019/extlst" xmlns:r="http://schemas.openxmlformats.org/officeDocument/2006/relationships" xmlns:m="http://schemas.openxmlformats.org/officeDocument/2006/math" xmlns:v="urn:schemas-microsoft-com:vml" xmlns:wp14="http://schemas.microsoft.com/office/word/2010/wordprocessingDrawing" xmlns:wp="http://schemas.openxmlformats.org/drawingml/2006/wordprocessingDrawing" xmlns:w10="urn:schemas-microsoft-com:office:word" xmlns:w="http://schemas.openxmlformats.org/wordprocessingml/2006/main" xmlns:w14="http://schemas.microsoft.com/office/word/2010/wordml" xmlns:w15="http://schemas.microsoft.com/office/word/2012/wordml" xmlns:w16cex="http://schemas.microsoft.com/office/word/2018/wordml/cex" xmlns:w16cid="http://schemas.microsoft.com/office/word/2016/wordml/cid" xmlns:w16="http://schemas.microsoft.com/office/word/2018/wordml" xmlns:w16du="http://schemas.microsoft.com/office/word/2023/wordml/word16du" xmlns:w16sdtdh="http://schemas.microsoft.com/office/word/2020/wordml/sdtdatahash" xmlns:w16sdtfl="http://schemas.microsoft.com/office/word/2024/wordml/sdtformatlock" xmlns:w16se="http://schemas.microsoft.com/office/word/2015/wordml/symex" xmlns:wpg="http://schemas.microsoft.com/office/word/2010/wordprocessingGroup" xmlns:wpi="http://schemas.microsoft.com/office/word/2010/wordprocessingInk" xmlns:wne="http://schemas.microsoft.com/office/word/2006/wordml" xmlns:wps="http://schemas.microsoft.com/office/word/2010/wordprocessingShape" mc:Ignorable="w14 w15 w16se w16cid w16 w16cex w16sdtdh w16sdtfl w16du wp14">
   <w:p>
     <w:pPr>
-      <w:pStyle w:val="a6"/>
+      <w:pStyle w:val="a7"/>
       <w:jc w:val="center"/>
       <w:rPr>
         <w:rFonts w:ascii="TH SarabunIT๙" w:hAnsi="TH SarabunIT๙" w:cs="TH SarabunIT๙"/>
@@ -2858,11 +2954,8 @@
   </w:p>
   <w:p>
     <w:pPr>
-      <w:pStyle w:val="a6"/>
+      <w:pStyle w:val="a7"/>
       <w:ind w:right="360"/>
-      <w:rPr>
-        <w:rFonts w:hint="cs"/>
-      </w:rPr>
     </w:pPr>
   </w:p>
 </w:hdr>
@@ -4740,6 +4833,50 @@
     <w:lsdException w:name="Subtitle" w:uiPriority="11" w:qFormat="1"/>
     <w:lsdException w:name="Strong" w:qFormat="1"/>
     <w:lsdException w:name="Emphasis" w:qFormat="1"/>
+    <w:lsdException w:name="Normal Table" w:semiHidden="1" w:unhideWhenUsed="1"/>
+    <w:lsdException w:name="Table Simple 1" w:semiHidden="1" w:unhideWhenUsed="1"/>
+    <w:lsdException w:name="Table Simple 2" w:semiHidden="1" w:unhideWhenUsed="1"/>
+    <w:lsdException w:name="Table Simple 3" w:semiHidden="1" w:unhideWhenUsed="1"/>
+    <w:lsdException w:name="Table Classic 1" w:semiHidden="1" w:unhideWhenUsed="1"/>
+    <w:lsdException w:name="Table Classic 2" w:semiHidden="1" w:unhideWhenUsed="1"/>
+    <w:lsdException w:name="Table Classic 3" w:semiHidden="1" w:unhideWhenUsed="1"/>
+    <w:lsdException w:name="Table Classic 4" w:semiHidden="1" w:unhideWhenUsed="1"/>
+    <w:lsdException w:name="Table Colorful 1" w:semiHidden="1" w:unhideWhenUsed="1"/>
+    <w:lsdException w:name="Table Colorful 2" w:semiHidden="1" w:unhideWhenUsed="1"/>
+    <w:lsdException w:name="Table Colorful 3" w:semiHidden="1" w:unhideWhenUsed="1"/>
+    <w:lsdException w:name="Table Columns 1" w:semiHidden="1" w:unhideWhenUsed="1"/>
+    <w:lsdException w:name="Table Columns 2" w:semiHidden="1" w:unhideWhenUsed="1"/>
+    <w:lsdException w:name="Table Columns 3" w:semiHidden="1" w:unhideWhenUsed="1"/>
+    <w:lsdException w:name="Table Columns 4" w:semiHidden="1" w:unhideWhenUsed="1"/>
+    <w:lsdException w:name="Table Columns 5" w:semiHidden="1" w:unhideWhenUsed="1"/>
+    <w:lsdException w:name="Table Grid 1" w:semiHidden="1" w:unhideWhenUsed="1"/>
+    <w:lsdException w:name="Table Grid 2" w:semiHidden="1" w:unhideWhenUsed="1"/>
+    <w:lsdException w:name="Table Grid 3" w:semiHidden="1" w:unhideWhenUsed="1"/>
+    <w:lsdException w:name="Table Grid 4" w:semiHidden="1" w:unhideWhenUsed="1"/>
+    <w:lsdException w:name="Table Grid 5" w:semiHidden="1" w:unhideWhenUsed="1"/>
+    <w:lsdException w:name="Table Grid 6" w:semiHidden="1" w:unhideWhenUsed="1"/>
+    <w:lsdException w:name="Table Grid 7" w:semiHidden="1" w:unhideWhenUsed="1"/>
+    <w:lsdException w:name="Table Grid 8" w:semiHidden="1" w:unhideWhenUsed="1"/>
+    <w:lsdException w:name="Table List 1" w:semiHidden="1" w:unhideWhenUsed="1"/>
+    <w:lsdException w:name="Table List 2" w:semiHidden="1" w:unhideWhenUsed="1"/>
+    <w:lsdException w:name="Table List 3" w:semiHidden="1" w:unhideWhenUsed="1"/>
+    <w:lsdException w:name="Table List 4" w:semiHidden="1" w:unhideWhenUsed="1"/>
+    <w:lsdException w:name="Table List 5" w:semiHidden="1" w:unhideWhenUsed="1"/>
+    <w:lsdException w:name="Table List 6" w:semiHidden="1" w:unhideWhenUsed="1"/>
+    <w:lsdException w:name="Table List 7" w:semiHidden="1" w:unhideWhenUsed="1"/>
+    <w:lsdException w:name="Table List 8" w:semiHidden="1" w:unhideWhenUsed="1"/>
+    <w:lsdException w:name="Table 3D effects 1" w:semiHidden="1" w:unhideWhenUsed="1"/>
+    <w:lsdException w:name="Table 3D effects 2" w:semiHidden="1" w:unhideWhenUsed="1"/>
+    <w:lsdException w:name="Table 3D effects 3" w:semiHidden="1" w:unhideWhenUsed="1"/>
+    <w:lsdException w:name="Table Contemporary" w:semiHidden="1" w:unhideWhenUsed="1"/>
+    <w:lsdException w:name="Table Elegant" w:semiHidden="1" w:unhideWhenUsed="1"/>
+    <w:lsdException w:name="Table Professional" w:semiHidden="1" w:unhideWhenUsed="1"/>
+    <w:lsdException w:name="Table Subtle 1" w:semiHidden="1" w:unhideWhenUsed="1"/>
+    <w:lsdException w:name="Table Subtle 2" w:semiHidden="1" w:unhideWhenUsed="1"/>
+    <w:lsdException w:name="Table Web 1" w:semiHidden="1" w:unhideWhenUsed="1"/>
+    <w:lsdException w:name="Table Web 2" w:semiHidden="1" w:unhideWhenUsed="1"/>
+    <w:lsdException w:name="Table Web 3" w:semiHidden="1" w:unhideWhenUsed="1"/>
+    <w:lsdException w:name="Table Theme" w:semiHidden="1" w:unhideWhenUsed="1"/>
     <w:lsdException w:name="Placeholder Text" w:semiHidden="1" w:uiPriority="99"/>
     <w:lsdException w:name="No Spacing" w:uiPriority="1" w:qFormat="1"/>
     <w:lsdException w:name="Light Shading" w:uiPriority="60"/>
@@ -5122,12 +5259,16 @@
     </w:rPr>
   </w:style>
   <w:style w:type="character" w:default="1" w:styleId="a0">
-    <w:name w:val="แบบอักษรของย่อหน้าเริ่มต้น"/>
+    <w:name w:val="Default Paragraph Font"/>
+    <w:uiPriority w:val="1"/>
     <w:semiHidden/>
+    <w:unhideWhenUsed/>
   </w:style>
   <w:style w:type="table" w:default="1" w:styleId="a1">
     <w:name w:val="Normal Table"/>
+    <w:uiPriority w:val="99"/>
     <w:semiHidden/>
+    <w:unhideWhenUsed/>
     <w:tblPr>
       <w:tblInd w:w="0" w:type="dxa"/>
       <w:tblCellMar>
@@ -5140,9 +5281,15 @@
   </w:style>
   <w:style w:type="numbering" w:default="1" w:styleId="a2">
     <w:name w:val="No List"/>
+    <w:uiPriority w:val="99"/>
+    <w:semiHidden/>
+    <w:unhideWhenUsed/>
+  </w:style>
+  <w:style w:type="character" w:customStyle="1" w:styleId="a3">
+    <w:name w:val="แบบอักษรของย่อหน้าเริ่มต้น"/>
     <w:semiHidden/>
   </w:style>
-  <w:style w:type="paragraph" w:styleId="a3">
+  <w:style w:type="paragraph" w:styleId="a4">
     <w:name w:val="caption"/>
     <w:basedOn w:val="a"/>
     <w:next w:val="a"/>
@@ -5156,7 +5303,7 @@
       <w:szCs w:val="32"/>
     </w:rPr>
   </w:style>
-  <w:style w:type="paragraph" w:styleId="a4">
+  <w:style w:type="paragraph" w:styleId="a5">
     <w:name w:val="Body Text"/>
     <w:basedOn w:val="a"/>
     <w:pPr>
@@ -5167,7 +5314,7 @@
       <w:szCs w:val="32"/>
     </w:rPr>
   </w:style>
-  <w:style w:type="paragraph" w:styleId="a5">
+  <w:style w:type="paragraph" w:styleId="a6">
     <w:name w:val="Document Map"/>
     <w:basedOn w:val="a"/>
     <w:semiHidden/>
@@ -5180,10 +5327,10 @@
       <w:szCs w:val="24"/>
     </w:rPr>
   </w:style>
-  <w:style w:type="paragraph" w:styleId="a6">
+  <w:style w:type="paragraph" w:styleId="a7">
     <w:name w:val="header"/>
     <w:basedOn w:val="a"/>
-    <w:link w:val="a7"/>
+    <w:link w:val="a8"/>
     <w:uiPriority w:val="99"/>
     <w:rsid w:val="00046558"/>
     <w:pPr>
@@ -5197,9 +5344,9 @@
       <w:lang w:val="x-none" w:eastAsia="x-none"/>
     </w:rPr>
   </w:style>
-  <w:style w:type="character" w:customStyle="1" w:styleId="a7">
+  <w:style w:type="character" w:customStyle="1" w:styleId="a8">
     <w:name w:val="หัวกระดาษ อักขระ"/>
-    <w:link w:val="a6"/>
+    <w:link w:val="a7"/>
     <w:uiPriority w:val="99"/>
     <w:rsid w:val="00046558"/>
     <w:rPr>
@@ -5207,10 +5354,10 @@
       <w:szCs w:val="35"/>
     </w:rPr>
   </w:style>
-  <w:style w:type="paragraph" w:styleId="a8">
+  <w:style w:type="paragraph" w:styleId="a9">
     <w:name w:val="footer"/>
     <w:basedOn w:val="a"/>
-    <w:link w:val="a9"/>
+    <w:link w:val="aa"/>
     <w:rsid w:val="00046558"/>
     <w:pPr>
       <w:tabs>
@@ -5223,16 +5370,16 @@
       <w:lang w:val="x-none" w:eastAsia="x-none"/>
     </w:rPr>
   </w:style>
-  <w:style w:type="character" w:customStyle="1" w:styleId="a9">
+  <w:style w:type="character" w:customStyle="1" w:styleId="aa">
     <w:name w:val="ท้ายกระดาษ อักขระ"/>
-    <w:link w:val="a8"/>
+    <w:link w:val="a9"/>
     <w:rsid w:val="00046558"/>
     <w:rPr>
       <w:sz w:val="28"/>
       <w:szCs w:val="35"/>
     </w:rPr>
   </w:style>
-  <w:style w:type="table" w:styleId="aa">
+  <w:style w:type="table" w:styleId="ab">
     <w:name w:val="Table Grid"/>
     <w:basedOn w:val="a1"/>
     <w:rsid w:val="003E40FC"/>
@@ -5250,7 +5397,7 @@
       </w:tblBorders>
     </w:tblPr>
   </w:style>
-  <w:style w:type="character" w:styleId="ab">
+  <w:style w:type="character" w:styleId="ac">
     <w:name w:val="page number"/>
     <w:rsid w:val="005D5F25"/>
   </w:style>
@@ -5276,7 +5423,7 @@
       <w:bCs/>
     </w:rPr>
   </w:style>
-  <w:style w:type="paragraph" w:styleId="ac">
+  <w:style w:type="paragraph" w:styleId="ad">
     <w:name w:val="Normal (Web)"/>
     <w:basedOn w:val="a"/>
     <w:rsid w:val="002513D8"/>
@@ -5289,10 +5436,10 @@
       <w:szCs w:val="24"/>
     </w:rPr>
   </w:style>
-  <w:style w:type="paragraph" w:styleId="ad">
+  <w:style w:type="paragraph" w:styleId="ae">
     <w:name w:val="Balloon Text"/>
     <w:basedOn w:val="a"/>
-    <w:link w:val="ae"/>
+    <w:link w:val="af"/>
     <w:rsid w:val="00F236E5"/>
     <w:rPr>
       <w:rFonts w:ascii="Leelawadee" w:hAnsi="Leelawadee"/>
@@ -5301,9 +5448,9 @@
       <w:lang w:val="x-none" w:eastAsia="x-none"/>
     </w:rPr>
   </w:style>
-  <w:style w:type="character" w:customStyle="1" w:styleId="ae">
+  <w:style w:type="character" w:customStyle="1" w:styleId="af">
     <w:name w:val="ข้อความบอลลูน อักขระ"/>
-    <w:link w:val="ad"/>
+    <w:link w:val="ae"/>
     <w:rsid w:val="00F236E5"/>
     <w:rPr>
       <w:rFonts w:ascii="Leelawadee" w:hAnsi="Leelawadee"/>
@@ -5311,7 +5458,7 @@
       <w:szCs w:val="22"/>
     </w:rPr>
   </w:style>
-  <w:style w:type="paragraph" w:styleId="af">
+  <w:style w:type="paragraph" w:styleId="af0">
     <w:name w:val="List Paragraph"/>
     <w:basedOn w:val="a"/>
     <w:uiPriority w:val="34"/>
@@ -5327,11 +5474,11 @@
       <w:sz w:val="22"/>
     </w:rPr>
   </w:style>
-  <w:style w:type="paragraph" w:styleId="af0">
+  <w:style w:type="paragraph" w:styleId="af1">
     <w:name w:val="Subtitle"/>
     <w:basedOn w:val="a"/>
     <w:next w:val="a"/>
-    <w:link w:val="af1"/>
+    <w:link w:val="af2"/>
     <w:uiPriority w:val="11"/>
     <w:qFormat/>
     <w:rsid w:val="00A457E2"/>
@@ -5346,9 +5493,9 @@
       <w:szCs w:val="30"/>
     </w:rPr>
   </w:style>
-  <w:style w:type="character" w:customStyle="1" w:styleId="af1">
+  <w:style w:type="character" w:customStyle="1" w:styleId="af2">
     <w:name w:val="ชื่อเรื่องรอง อักขระ"/>
-    <w:link w:val="af0"/>
+    <w:link w:val="af1"/>
     <w:uiPriority w:val="11"/>
     <w:rsid w:val="00A457E2"/>
     <w:rPr>
@@ -5370,7 +5517,7 @@
       <w:szCs w:val="33"/>
     </w:rPr>
   </w:style>
-  <w:style w:type="character" w:styleId="af2">
+  <w:style w:type="character" w:styleId="af3">
     <w:name w:val="Hyperlink"/>
     <w:rsid w:val="00D6358C"/>
     <w:rPr>
@@ -5378,7 +5525,7 @@
       <w:u w:val="single"/>
     </w:rPr>
   </w:style>
-  <w:style w:type="character" w:styleId="af3">
+  <w:style w:type="character" w:styleId="af4">
     <w:name w:val="Unresolved Mention"/>
     <w:uiPriority w:val="99"/>
     <w:semiHidden/>

</xml_diff>